<commit_message>
added professionalism and body of knowledge
</commit_message>
<xml_diff>
--- a/ACS-Recognition-of-Prior-Learning-Form-2024-v2.docx
+++ b/ACS-Recognition-of-Prior-Learning-Form-2024-v2.docx
@@ -6862,6 +6862,19 @@
                 <w:rFonts w:ascii="Arial" w:hAnsi="Arial" w:cs="Arial"/>
                 <w:sz w:val="20"/>
               </w:rPr>
+              <w:t xml:space="preserve">ICT Infrastructure</w:t>
+            </w:r>
+            <w:r>
+              <w:rPr>
+                <w:rFonts w:ascii="Arial" w:hAnsi="Arial" w:cs="Arial"/>
+                <w:sz w:val="20"/>
+              </w:rPr>
+            </w:r>
+            <w:r>
+              <w:rPr>
+                <w:rFonts w:ascii="Arial" w:hAnsi="Arial" w:cs="Arial"/>
+                <w:sz w:val="20"/>
+              </w:rPr>
             </w:r>
             <w:r>
               <w:rPr>
@@ -6943,6 +6956,19 @@
                 <w:rFonts w:ascii="Arial" w:hAnsi="Arial" w:cs="Arial"/>
                 <w:sz w:val="20"/>
               </w:rPr>
+              <w:t xml:space="preserve">Application Systems</w:t>
+            </w:r>
+            <w:r>
+              <w:rPr>
+                <w:rFonts w:ascii="Arial" w:hAnsi="Arial" w:cs="Arial"/>
+                <w:sz w:val="20"/>
+              </w:rPr>
+            </w:r>
+            <w:r>
+              <w:rPr>
+                <w:rFonts w:ascii="Arial" w:hAnsi="Arial" w:cs="Arial"/>
+                <w:sz w:val="20"/>
+              </w:rPr>
             </w:r>
             <w:r>
               <w:rPr>
@@ -7192,18 +7218,715 @@
               <w:pBdr/>
               <w:spacing/>
               <w:ind/>
-              <w:rPr>
-                <w:rFonts w:ascii="Arial" w:hAnsi="Arial" w:cs="Arial"/>
-                <w:sz w:val="20"/>
-              </w:rPr>
+              <w:rPr/>
             </w:pPr>
             <w:r>
               <w:rPr>
                 <w:rFonts w:ascii="Arial" w:hAnsi="Arial" w:cs="Arial"/>
                 <w:sz w:val="20"/>
               </w:rPr>
-              <w:t xml:space="preserve">[EXPANDABLE TEXT AREA]</w:t>
-            </w:r>
+              <w:t xml:space="preserve">My professional experience has developed these two core ICT knowledge areas through work on embedded automotive platforms, AUTOSAR-based software, distributed controller</w:t>
+            </w:r>
+            <w:r/>
+          </w:p>
+          <w:p>
+            <w:pPr>
+              <w:pBdr/>
+              <w:spacing/>
+              <w:ind/>
+              <w:rPr/>
+            </w:pPr>
+            <w:r>
+              <w:rPr>
+                <w:rFonts w:ascii="Arial" w:hAnsi="Arial" w:cs="Arial"/>
+                <w:sz w:val="20"/>
+              </w:rPr>
+              <w:t xml:space="preserve">architectures, and system integration projects across Vector, BorgWarner, and IAV.</w:t>
+            </w:r>
+            <w:r/>
+          </w:p>
+          <w:p>
+            <w:pPr>
+              <w:pBdr/>
+              <w:spacing/>
+              <w:ind/>
+              <w:rPr/>
+            </w:pPr>
+            <w:r>
+              <w:rPr>
+                <w:rFonts w:ascii="Arial" w:hAnsi="Arial" w:cs="Arial"/>
+                <w:sz w:val="20"/>
+              </w:rPr>
+            </w:r>
+            <w:r/>
+          </w:p>
+          <w:p>
+            <w:pPr>
+              <w:pBdr/>
+              <w:spacing/>
+              <w:ind/>
+              <w:rPr/>
+            </w:pPr>
+            <w:r>
+              <w:rPr>
+                <w:rFonts w:ascii="Arial" w:hAnsi="Arial" w:cs="Arial"/>
+                <w:sz w:val="20"/>
+              </w:rPr>
+              <w:t xml:space="preserve">I developed my knowledge of ICT Infrastructure first at Vector, where I worked on embedded software solutions based on CANbedded. This stack provided</w:t>
+            </w:r>
+            <w:r/>
+          </w:p>
+          <w:p>
+            <w:pPr>
+              <w:pBdr/>
+              <w:spacing/>
+              <w:ind/>
+              <w:rPr/>
+            </w:pPr>
+            <w:r>
+              <w:rPr>
+                <w:rFonts w:ascii="Arial" w:hAnsi="Arial" w:cs="Arial"/>
+                <w:sz w:val="20"/>
+              </w:rPr>
+              <w:t xml:space="preserve">support for the CAN driver, diagnostics, and communication layers, including higher-layer abstraction to simplify integration into customer application software. Most of</w:t>
+            </w:r>
+            <w:r/>
+          </w:p>
+          <w:p>
+            <w:pPr>
+              <w:pBdr/>
+              <w:spacing/>
+              <w:ind/>
+              <w:rPr/>
+            </w:pPr>
+            <w:r>
+              <w:rPr>
+                <w:rFonts w:ascii="Arial" w:hAnsi="Arial" w:cs="Arial"/>
+                <w:sz w:val="20"/>
+              </w:rPr>
+              <w:t xml:space="preserve">these customers were Tier 1 suppliers for Ford. This work gave me practical exposure to embedded hardware environments, layered communication software, and the role of</w:t>
+            </w:r>
+            <w:r/>
+          </w:p>
+          <w:p>
+            <w:pPr>
+              <w:pBdr/>
+              <w:spacing/>
+              <w:ind/>
+              <w:rPr/>
+            </w:pPr>
+            <w:r>
+              <w:rPr>
+                <w:rFonts w:ascii="Arial" w:hAnsi="Arial" w:cs="Arial"/>
+                <w:sz w:val="20"/>
+              </w:rPr>
+              <w:t xml:space="preserve">software within networked vehicle systems.</w:t>
+            </w:r>
+            <w:r/>
+          </w:p>
+          <w:p>
+            <w:pPr>
+              <w:pBdr/>
+              <w:spacing/>
+              <w:ind/>
+              <w:rPr/>
+            </w:pPr>
+            <w:r>
+              <w:rPr>
+                <w:rFonts w:ascii="Arial" w:hAnsi="Arial" w:cs="Arial"/>
+                <w:sz w:val="20"/>
+              </w:rPr>
+            </w:r>
+            <w:r/>
+          </w:p>
+          <w:p>
+            <w:pPr>
+              <w:pBdr/>
+              <w:spacing/>
+              <w:ind/>
+              <w:rPr/>
+            </w:pPr>
+            <w:r>
+              <w:rPr>
+                <w:rFonts w:ascii="Arial" w:hAnsi="Arial" w:cs="Arial"/>
+                <w:sz w:val="20"/>
+              </w:rPr>
+              <w:t xml:space="preserve">At BorgWarner, this knowledge became deeper through AUTOSAR-based platform work. My first BorgWarner project was the Transfer Case Control Module (TCCM)</w:t>
+            </w:r>
+            <w:r/>
+          </w:p>
+          <w:p>
+            <w:pPr>
+              <w:pBdr/>
+              <w:spacing/>
+              <w:ind/>
+              <w:rPr/>
+            </w:pPr>
+            <w:r>
+              <w:rPr>
+                <w:rFonts w:ascii="Arial" w:hAnsi="Arial" w:cs="Arial"/>
+                <w:sz w:val="20"/>
+              </w:rPr>
+              <w:t xml:space="preserve">used in GM vehicles. This module manages 4WD shifting operations by processing driver shift requests, controlling the transfer case encoder motor, and verifying shift</w:t>
+            </w:r>
+            <w:r/>
+          </w:p>
+          <w:p>
+            <w:pPr>
+              <w:pBdr/>
+              <w:spacing/>
+              <w:ind/>
+              <w:rPr/>
+            </w:pPr>
+            <w:r>
+              <w:rPr>
+                <w:rFonts w:ascii="Arial" w:hAnsi="Arial" w:cs="Arial"/>
+                <w:sz w:val="20"/>
+              </w:rPr>
+              <w:t xml:space="preserve">completion. It was the first BorgWarner project to use AUTOSAR, and I worked as the main software integrator. In one release, I also created the first version of the device</w:t>
+            </w:r>
+            <w:r/>
+          </w:p>
+          <w:p>
+            <w:pPr>
+              <w:pBdr/>
+              <w:spacing/>
+              <w:ind/>
+              <w:rPr/>
+            </w:pPr>
+            <w:r>
+              <w:rPr>
+                <w:rFonts w:ascii="Arial" w:hAnsi="Arial" w:cs="Arial"/>
+                <w:sz w:val="20"/>
+              </w:rPr>
+              <w:t xml:space="preserve">driver for a then-new Infineon System Basis Chip (SBC). My initial implementation controlled the power rails, CAN transceiver, and watchdog behavior within the SBC. This was</w:t>
+            </w:r>
+            <w:r/>
+          </w:p>
+          <w:p>
+            <w:pPr>
+              <w:pBdr/>
+              <w:spacing/>
+              <w:ind/>
+              <w:rPr/>
+            </w:pPr>
+            <w:r>
+              <w:rPr>
+                <w:rFonts w:ascii="Arial" w:hAnsi="Arial" w:cs="Arial"/>
+                <w:sz w:val="20"/>
+              </w:rPr>
+              <w:t xml:space="preserve">the first time I developed a device driver from scratch for a product delivery, which strengthened my ability to convert hardware behavior and product requirements</w:t>
+            </w:r>
+            <w:r/>
+          </w:p>
+          <w:p>
+            <w:pPr>
+              <w:pBdr/>
+              <w:spacing/>
+              <w:ind/>
+              <w:rPr/>
+            </w:pPr>
+            <w:r>
+              <w:rPr>
+                <w:rFonts w:ascii="Arial" w:hAnsi="Arial" w:cs="Arial"/>
+                <w:sz w:val="20"/>
+              </w:rPr>
+              <w:t xml:space="preserve">into production-ready low-level software within an AUTOSAR-based embedded platform.</w:t>
+            </w:r>
+            <w:r/>
+          </w:p>
+          <w:p>
+            <w:pPr>
+              <w:pBdr/>
+              <w:spacing/>
+              <w:ind/>
+              <w:rPr/>
+            </w:pPr>
+            <w:r>
+              <w:rPr>
+                <w:rFonts w:ascii="Arial" w:hAnsi="Arial" w:cs="Arial"/>
+                <w:sz w:val="20"/>
+              </w:rPr>
+            </w:r>
+            <w:r/>
+          </w:p>
+          <w:p>
+            <w:pPr>
+              <w:pBdr/>
+              <w:spacing/>
+              <w:ind/>
+              <w:rPr/>
+            </w:pPr>
+            <w:r>
+              <w:rPr>
+                <w:rFonts w:ascii="Arial" w:hAnsi="Arial" w:cs="Arial"/>
+                <w:sz w:val="20"/>
+              </w:rPr>
+              <w:t xml:space="preserve">I expanded this infrastructure knowledge further through the TSGen project, which focused on a 48V hybrid electric vehicle powertrain system for Audi. The system integrated</w:t>
+            </w:r>
+            <w:r/>
+          </w:p>
+          <w:p>
+            <w:pPr>
+              <w:pBdr/>
+              <w:spacing/>
+              <w:ind/>
+              <w:rPr/>
+            </w:pPr>
+            <w:r>
+              <w:rPr>
+                <w:rFonts w:ascii="Arial" w:hAnsi="Arial" w:cs="Arial"/>
+                <w:sz w:val="20"/>
+              </w:rPr>
+              <w:t xml:space="preserve">an electric motor, transmission, and inverter into a single unit and communicated using FlexRay. This gave me broader exposure to powertrain-oriented embedded</w:t>
+            </w:r>
+            <w:r/>
+          </w:p>
+          <w:p>
+            <w:pPr>
+              <w:pBdr/>
+              <w:spacing/>
+              <w:ind/>
+              <w:rPr/>
+            </w:pPr>
+            <w:r>
+              <w:rPr>
+                <w:rFonts w:ascii="Arial" w:hAnsi="Arial" w:cs="Arial"/>
+                <w:sz w:val="20"/>
+              </w:rPr>
+              <w:t xml:space="preserve">infrastructure, communication protocols beyond CAN and LIN, and integration challenges in electrically and mechanically coupled systems. It also influenced how I later</w:t>
+            </w:r>
+            <w:r/>
+          </w:p>
+          <w:p>
+            <w:pPr>
+              <w:pBdr/>
+              <w:spacing/>
+              <w:ind/>
+              <w:rPr/>
+            </w:pPr>
+            <w:r>
+              <w:rPr>
+                <w:rFonts w:ascii="Arial" w:hAnsi="Arial" w:cs="Arial"/>
+                <w:sz w:val="20"/>
+              </w:rPr>
+              <w:t xml:space="preserve">approached diagnostic architecture and inspired the development of the InfraDID Config tool for standardizing infrastructure-level diagnostic data implementation.</w:t>
+            </w:r>
+            <w:r/>
+          </w:p>
+          <w:p>
+            <w:pPr>
+              <w:pBdr/>
+              <w:spacing/>
+              <w:ind/>
+              <w:rPr/>
+            </w:pPr>
+            <w:r>
+              <w:rPr>
+                <w:rFonts w:ascii="Arial" w:hAnsi="Arial" w:cs="Arial"/>
+                <w:sz w:val="20"/>
+              </w:rPr>
+            </w:r>
+            <w:r/>
+          </w:p>
+          <w:p>
+            <w:pPr>
+              <w:pBdr/>
+              <w:spacing/>
+              <w:ind/>
+              <w:rPr/>
+            </w:pPr>
+            <w:r>
+              <w:rPr>
+                <w:rFonts w:ascii="Arial" w:hAnsi="Arial" w:cs="Arial"/>
+                <w:sz w:val="20"/>
+              </w:rPr>
+              <w:t xml:space="preserve">At IAV, I expanded my infrastructure knowledge into distributed and cyber-physical systems. I designed and implemented layered embedded software architecture</w:t>
+            </w:r>
+            <w:r/>
+          </w:p>
+          <w:p>
+            <w:pPr>
+              <w:pBdr/>
+              <w:spacing/>
+              <w:ind/>
+              <w:rPr/>
+            </w:pPr>
+            <w:r>
+              <w:rPr>
+                <w:rFonts w:ascii="Arial" w:hAnsi="Arial" w:cs="Arial"/>
+                <w:sz w:val="20"/>
+              </w:rPr>
+              <w:t xml:space="preserve">for the NXP S32K platform using an internal framework, and I worked on a multi-processor Software-Defined Vehicle (SDV) platform using NVIDIA Jetson for cloud connectivity</w:t>
+            </w:r>
+            <w:r/>
+          </w:p>
+          <w:p>
+            <w:pPr>
+              <w:pBdr/>
+              <w:spacing/>
+              <w:ind/>
+              <w:rPr/>
+            </w:pPr>
+            <w:r>
+              <w:rPr>
+                <w:rFonts w:ascii="Arial" w:hAnsi="Arial" w:cs="Arial"/>
+                <w:sz w:val="20"/>
+              </w:rPr>
+              <w:t xml:space="preserve">and GUI, Renesas R-Car for application execution, and the IAV Dragoon ECU for vehicle interfacing. This strengthened my understanding of distributed systems, system</w:t>
+            </w:r>
+            <w:r/>
+          </w:p>
+          <w:p>
+            <w:pPr>
+              <w:pBdr/>
+              <w:spacing/>
+              <w:ind/>
+              <w:rPr/>
+            </w:pPr>
+            <w:r>
+              <w:rPr>
+                <w:rFonts w:ascii="Arial" w:hAnsi="Arial" w:cs="Arial"/>
+                <w:sz w:val="20"/>
+              </w:rPr>
+              <w:t xml:space="preserve">partitioning, communication links between processing environments, and the relationship between low-level software, communication services, and application logic.</w:t>
+            </w:r>
+            <w:r/>
+          </w:p>
+          <w:p>
+            <w:pPr>
+              <w:pBdr/>
+              <w:spacing/>
+              <w:ind/>
+              <w:rPr/>
+            </w:pPr>
+            <w:r>
+              <w:rPr>
+                <w:rFonts w:ascii="Arial" w:hAnsi="Arial" w:cs="Arial"/>
+                <w:sz w:val="20"/>
+              </w:rPr>
+            </w:r>
+            <w:r/>
+          </w:p>
+          <w:p>
+            <w:pPr>
+              <w:pBdr/>
+              <w:spacing/>
+              <w:ind/>
+              <w:rPr/>
+            </w:pPr>
+            <w:r>
+              <w:rPr>
+                <w:rFonts w:ascii="Arial" w:hAnsi="Arial" w:cs="Arial"/>
+                <w:sz w:val="20"/>
+              </w:rPr>
+              <w:t xml:space="preserve">I developed my knowledge of Application Systems through roles that required me to understand how software components support operational goals, user expectations, and system</w:t>
+            </w:r>
+            <w:r/>
+          </w:p>
+          <w:p>
+            <w:pPr>
+              <w:pBdr/>
+              <w:spacing/>
+              <w:ind/>
+              <w:rPr/>
+            </w:pPr>
+            <w:r>
+              <w:rPr>
+                <w:rFonts w:ascii="Arial" w:hAnsi="Arial" w:cs="Arial"/>
+                <w:sz w:val="20"/>
+              </w:rPr>
+              <w:t xml:space="preserve">behavior in real contexts. At Vector, I supported embedded software solutions built around the CANbedded stack. Because these projects were intended for</w:t>
+            </w:r>
+            <w:r/>
+          </w:p>
+          <w:p>
+            <w:pPr>
+              <w:pBdr/>
+              <w:spacing/>
+              <w:ind/>
+              <w:rPr/>
+            </w:pPr>
+            <w:r>
+              <w:rPr>
+                <w:rFonts w:ascii="Arial" w:hAnsi="Arial" w:cs="Arial"/>
+                <w:sz w:val="20"/>
+              </w:rPr>
+              <w:t xml:space="preserve">Tier 1 suppliers serving Ford programs, I had to understand how communication and diagnostic layers would be integrated into each customer's application software and adapted</w:t>
+            </w:r>
+            <w:r/>
+          </w:p>
+          <w:p>
+            <w:pPr>
+              <w:pBdr/>
+              <w:spacing/>
+              <w:ind/>
+              <w:rPr/>
+            </w:pPr>
+            <w:r>
+              <w:rPr>
+                <w:rFonts w:ascii="Arial" w:hAnsi="Arial" w:cs="Arial"/>
+                <w:sz w:val="20"/>
+              </w:rPr>
+              <w:t xml:space="preserve">to their system constraints. This gave me early exposure to the context in which application software is deployed and used.</w:t>
+            </w:r>
+            <w:r/>
+          </w:p>
+          <w:p>
+            <w:pPr>
+              <w:pBdr/>
+              <w:spacing/>
+              <w:ind/>
+              <w:rPr/>
+            </w:pPr>
+            <w:r>
+              <w:rPr>
+                <w:rFonts w:ascii="Arial" w:hAnsi="Arial" w:cs="Arial"/>
+                <w:sz w:val="20"/>
+              </w:rPr>
+            </w:r>
+            <w:r/>
+          </w:p>
+          <w:p>
+            <w:pPr>
+              <w:pBdr/>
+              <w:spacing/>
+              <w:ind/>
+              <w:rPr/>
+            </w:pPr>
+            <w:r>
+              <w:rPr>
+                <w:rFonts w:ascii="Arial" w:hAnsi="Arial" w:cs="Arial"/>
+                <w:sz w:val="20"/>
+              </w:rPr>
+              <w:t xml:space="preserve">At BorgWarner, I strengthened this area through projects where software behavior was directly tied to vehicle function and product goals. In the TCCM project, the</w:t>
+            </w:r>
+            <w:r/>
+          </w:p>
+          <w:p>
+            <w:pPr>
+              <w:pBdr/>
+              <w:spacing/>
+              <w:ind/>
+              <w:rPr/>
+            </w:pPr>
+            <w:r>
+              <w:rPr>
+                <w:rFonts w:ascii="Arial" w:hAnsi="Arial" w:cs="Arial"/>
+                <w:sz w:val="20"/>
+              </w:rPr>
+              <w:t xml:space="preserve">application system had to respond correctly to driver shift requests, coordinate the logic needed to execute the requested 4WD mode change, and verify that the shift</w:t>
+            </w:r>
+            <w:r/>
+          </w:p>
+          <w:p>
+            <w:pPr>
+              <w:pBdr/>
+              <w:spacing/>
+              <w:ind/>
+              <w:rPr/>
+            </w:pPr>
+            <w:r>
+              <w:rPr>
+                <w:rFonts w:ascii="Arial" w:hAnsi="Arial" w:cs="Arial"/>
+                <w:sz w:val="20"/>
+              </w:rPr>
+              <w:t xml:space="preserve">operation had completed successfully. In the TSGen project, software behavior had to support a 48V hybrid powertrain system integrating motor, transmission, and inverter</w:t>
+            </w:r>
+            <w:r/>
+          </w:p>
+          <w:p>
+            <w:pPr>
+              <w:pBdr/>
+              <w:spacing/>
+              <w:ind/>
+              <w:rPr/>
+            </w:pPr>
+            <w:r>
+              <w:rPr>
+                <w:rFonts w:ascii="Arial" w:hAnsi="Arial" w:cs="Arial"/>
+                <w:sz w:val="20"/>
+              </w:rPr>
+              <w:t xml:space="preserve">functions. These projects strengthened my understanding of how application systems must coordinate multiple components into a coherent functional system that satisfies</w:t>
+            </w:r>
+            <w:r/>
+          </w:p>
+          <w:p>
+            <w:pPr>
+              <w:pBdr/>
+              <w:spacing/>
+              <w:ind/>
+              <w:rPr/>
+            </w:pPr>
+            <w:r>
+              <w:rPr>
+                <w:rFonts w:ascii="Arial" w:hAnsi="Arial" w:cs="Arial"/>
+                <w:sz w:val="20"/>
+              </w:rPr>
+              <w:t xml:space="preserve">operational requirements, communication needs, and system-level expectations.</w:t>
+            </w:r>
+            <w:r/>
+          </w:p>
+          <w:p>
+            <w:pPr>
+              <w:pBdr/>
+              <w:spacing/>
+              <w:ind/>
+              <w:rPr/>
+            </w:pPr>
+            <w:r>
+              <w:rPr>
+                <w:rFonts w:ascii="Arial" w:hAnsi="Arial" w:cs="Arial"/>
+                <w:sz w:val="20"/>
+              </w:rPr>
+            </w:r>
+            <w:r/>
+          </w:p>
+          <w:p>
+            <w:pPr>
+              <w:pBdr/>
+              <w:spacing/>
+              <w:ind/>
+              <w:rPr/>
+            </w:pPr>
+            <w:r>
+              <w:rPr>
+                <w:rFonts w:ascii="Arial" w:hAnsi="Arial" w:cs="Arial"/>
+                <w:sz w:val="20"/>
+              </w:rPr>
+              <w:t xml:space="preserve">At IAV, I expanded this knowledge further through requirements engineering, software architecture, and system integration work. I translated customer requirements into</w:t>
+            </w:r>
+            <w:r/>
+          </w:p>
+          <w:p>
+            <w:pPr>
+              <w:pBdr/>
+              <w:spacing/>
+              <w:ind/>
+              <w:rPr/>
+            </w:pPr>
+            <w:r>
+              <w:rPr>
+                <w:rFonts w:ascii="Arial" w:hAnsi="Arial" w:cs="Arial"/>
+                <w:sz w:val="20"/>
+              </w:rPr>
+              <w:t xml:space="preserve">structured software requirements using tools such as DOORS and Polarion, ensuring that the resulting design, implementation, and testing aligned with system objectives. The</w:t>
+            </w:r>
+            <w:r/>
+          </w:p>
+          <w:p>
+            <w:pPr>
+              <w:pBdr/>
+              <w:spacing/>
+              <w:ind/>
+              <w:rPr/>
+            </w:pPr>
+            <w:r>
+              <w:rPr>
+                <w:rFonts w:ascii="Arial" w:hAnsi="Arial" w:cs="Arial"/>
+                <w:sz w:val="20"/>
+              </w:rPr>
+              <w:t xml:space="preserve">SDV demonstration platform is a strong example because it combined cloud connectivity, graphical user interaction, application execution, and vehicle interfacing into one</w:t>
+            </w:r>
+            <w:r/>
+          </w:p>
+          <w:p>
+            <w:pPr>
+              <w:pBdr/>
+              <w:spacing/>
+              <w:ind/>
+              <w:rPr/>
+            </w:pPr>
+            <w:r>
+              <w:rPr>
+                <w:rFonts w:ascii="Arial" w:hAnsi="Arial" w:cs="Arial"/>
+                <w:sz w:val="20"/>
+              </w:rPr>
+              <w:t xml:space="preserve">coherent platform. This required analysis of how system components should interact, what responsibilities belonged to each processing environment, and how the resulting</w:t>
+            </w:r>
+            <w:r/>
+          </w:p>
+          <w:p>
+            <w:pPr>
+              <w:pBdr/>
+              <w:spacing/>
+              <w:ind/>
+              <w:rPr/>
+            </w:pPr>
+            <w:r>
+              <w:rPr>
+                <w:rFonts w:ascii="Arial" w:hAnsi="Arial" w:cs="Arial"/>
+                <w:sz w:val="20"/>
+              </w:rPr>
+              <w:t xml:space="preserve">system would be understood and evaluated by customers.</w:t>
+            </w:r>
+            <w:r/>
+          </w:p>
+          <w:p>
+            <w:pPr>
+              <w:pBdr/>
+              <w:spacing/>
+              <w:ind/>
+              <w:rPr/>
+            </w:pPr>
+            <w:r>
+              <w:rPr>
+                <w:rFonts w:ascii="Arial" w:hAnsi="Arial" w:cs="Arial"/>
+                <w:sz w:val="20"/>
+              </w:rPr>
+            </w:r>
+            <w:r/>
+          </w:p>
+          <w:p>
+            <w:pPr>
+              <w:pBdr/>
+              <w:spacing/>
+              <w:ind/>
+              <w:rPr/>
+            </w:pPr>
+            <w:r>
+              <w:rPr>
+                <w:rFonts w:ascii="Arial" w:hAnsi="Arial" w:cs="Arial"/>
+                <w:sz w:val="20"/>
+              </w:rPr>
+              <w:t xml:space="preserve">Together, these experiences have given me an understanding of both ICT Infrastructure and Application Systems. I understand the hardware, communication protocols,</w:t>
+            </w:r>
+            <w:r/>
+          </w:p>
+          <w:p>
+            <w:pPr>
+              <w:pBdr/>
+              <w:spacing/>
+              <w:ind/>
+              <w:rPr/>
+            </w:pPr>
+            <w:r>
+              <w:rPr>
+                <w:rFonts w:ascii="Arial" w:hAnsi="Arial" w:cs="Arial"/>
+                <w:sz w:val="20"/>
+              </w:rPr>
+              <w:t xml:space="preserve">systems software, and distributed environments that support embedded computing systems, and how software components must be integrated into coherent systems that satisfy</w:t>
+            </w:r>
+            <w:r/>
+          </w:p>
+          <w:p>
+            <w:pPr>
+              <w:pBdr/>
+              <w:spacing/>
+              <w:ind/>
+              <w:rPr>
+                <w:rFonts w:ascii="Arial" w:hAnsi="Arial" w:cs="Arial"/>
+                <w:sz w:val="20"/>
+              </w:rPr>
+            </w:pPr>
+            <w:r>
+              <w:rPr>
+                <w:rFonts w:ascii="Arial" w:hAnsi="Arial" w:cs="Arial"/>
+                <w:sz w:val="20"/>
+              </w:rPr>
+              <w:t xml:space="preserve">technical and operational objectives.</w:t>
+            </w:r>
+            <w:r/>
             <w:r>
               <w:rPr>
                 <w:rFonts w:ascii="Arial" w:hAnsi="Arial" w:cs="Arial"/>

</xml_diff>